<commit_message>
Deploying to gh-pages from @ Morrison-Lab/qwt@183c452c954f76f2a08a82ec11f7991c9d1c245b 🚀
</commit_message>
<xml_diff>
--- a/index.docx
+++ b/index.docx
@@ -15,7 +15,7 @@
         <w:pStyle w:val="Date"/>
       </w:pPr>
       <w:r>
-        <w:t xml:space="preserve">Last modified: 2026-10-02 01:19:41 (PDT)</w:t>
+        <w:t xml:space="preserve">Last modified: 2026-10-05 12:20:18 (PDT)</w:t>
       </w:r>
     </w:p>
     <w:bookmarkStart w:id="17" w:name="welcome"/>
@@ -276,7 +276,7 @@
         <w:t xml:space="preserve"> </w:t>
       </w:r>
       <w:r>
-        <w:t xml:space="preserve">files for each page and add them to the navigation menu in</w:t>
+        <w:t xml:space="preserve">files for each page and add them to the navigation menu and the sidebar in</w:t>
       </w:r>
       <w:r>
         <w:t xml:space="preserve"> </w:t>
@@ -288,7 +288,10 @@
         <w:t xml:space="preserve">_quarto-website.yml</w:t>
       </w:r>
       <w:r>
-        <w:t xml:space="preserve">.</w:t>
+        <w:t xml:space="preserve"> </w:t>
+      </w:r>
+      <w:r>
+        <w:t xml:space="preserve">(the sidebar order sets the previous/next page links).</w:t>
       </w:r>
     </w:p>
     <w:p>

</xml_diff>